<commit_message>
fixup! temporary docs for LabWork14
</commit_message>
<xml_diff>
--- a/doc/LabWork_14.docx
+++ b/doc/LabWork_14.docx
@@ -6932,48 +6932,104 @@
       </w:r>
       <w:proofErr w:type="spellEnd"/>
       <w:r>
+        <w:t xml:space="preserve"> = hint</w:t>
+      </w:r>
+    </w:p>
+    <w:p>
+      <w:pPr>
+        <w:pStyle w:val="aa"/>
+      </w:pPr>
+      <w:r>
+        <w:t xml:space="preserve">                </w:t>
+      </w:r>
+      <w:proofErr w:type="spellStart"/>
+      <w:r>
+        <w:t>elif</w:t>
+      </w:r>
+      <w:proofErr w:type="spellEnd"/>
+      <w:r>
+        <w:t xml:space="preserve"> </w:t>
+      </w:r>
+      <w:proofErr w:type="spellStart"/>
+      <w:r>
+        <w:t>isinstance</w:t>
+      </w:r>
+      <w:proofErr w:type="spellEnd"/>
+      <w:r>
+        <w:t>(</w:t>
+      </w:r>
+      <w:proofErr w:type="spellStart"/>
+      <w:r>
+        <w:t>hint</w:t>
+      </w:r>
+      <w:proofErr w:type="spellEnd"/>
+      <w:r>
+        <w:t xml:space="preserve">, </w:t>
+      </w:r>
+      <w:proofErr w:type="spellStart"/>
+      <w:r>
+        <w:t>LargeTextHint</w:t>
+      </w:r>
+      <w:proofErr w:type="spellEnd"/>
+      <w:r>
+        <w:t>):</w:t>
+      </w:r>
+    </w:p>
+    <w:p>
+      <w:pPr>
+        <w:pStyle w:val="aa"/>
+      </w:pPr>
+      <w:r>
+        <w:t xml:space="preserve">                    </w:t>
+      </w:r>
+      <w:proofErr w:type="spellStart"/>
+      <w:r>
+        <w:t>large_text</w:t>
+      </w:r>
+      <w:proofErr w:type="spellEnd"/>
+      <w:r>
         <w:t xml:space="preserve"> = </w:t>
       </w:r>
       <w:proofErr w:type="spellStart"/>
       <w:r>
+        <w:t>True</w:t>
+      </w:r>
+      <w:proofErr w:type="spellEnd"/>
+    </w:p>
+    <w:p>
+      <w:pPr>
+        <w:pStyle w:val="aa"/>
+      </w:pPr>
+      <w:r>
+        <w:t xml:space="preserve">                </w:t>
+      </w:r>
+      <w:proofErr w:type="spellStart"/>
+      <w:r>
+        <w:t>elif</w:t>
+      </w:r>
+      <w:proofErr w:type="spellEnd"/>
+      <w:r>
+        <w:t xml:space="preserve"> </w:t>
+      </w:r>
+      <w:proofErr w:type="spellStart"/>
+      <w:r>
+        <w:t>isinstance</w:t>
+      </w:r>
+      <w:proofErr w:type="spellEnd"/>
+      <w:r>
+        <w:t>(</w:t>
+      </w:r>
+      <w:proofErr w:type="spellStart"/>
+      <w:r>
         <w:t>hint</w:t>
       </w:r>
       <w:proofErr w:type="spellEnd"/>
-    </w:p>
-    <w:p>
-      <w:pPr>
-        <w:pStyle w:val="aa"/>
-      </w:pPr>
-      <w:r>
-        <w:t xml:space="preserve">                </w:t>
-      </w:r>
-      <w:proofErr w:type="spellStart"/>
-      <w:r>
-        <w:t>elif</w:t>
-      </w:r>
-      <w:proofErr w:type="spellEnd"/>
-      <w:r>
-        <w:t xml:space="preserve"> </w:t>
-      </w:r>
-      <w:proofErr w:type="spellStart"/>
-      <w:r>
-        <w:t>isinstance</w:t>
-      </w:r>
-      <w:proofErr w:type="spellEnd"/>
-      <w:r>
-        <w:t>(</w:t>
-      </w:r>
-      <w:proofErr w:type="spellStart"/>
-      <w:r>
-        <w:t>hint</w:t>
-      </w:r>
-      <w:proofErr w:type="spellEnd"/>
       <w:r>
         <w:t xml:space="preserve">, </w:t>
       </w:r>
       <w:proofErr w:type="spellStart"/>
       <w:r>
-        <w:t>LargeTextHint</w:t>
+        <w:t>ListboxHint</w:t>
       </w:r>
       <w:proofErr w:type="spellEnd"/>
       <w:r>
@@ -6989,78 +7045,12 @@
       </w:r>
       <w:proofErr w:type="spellStart"/>
       <w:r>
-        <w:t>large_text</w:t>
-      </w:r>
-      <w:proofErr w:type="spellEnd"/>
-      <w:r>
-        <w:t xml:space="preserve"> = </w:t>
-      </w:r>
-      <w:proofErr w:type="spellStart"/>
-      <w:r>
-        <w:t>True</w:t>
-      </w:r>
-      <w:proofErr w:type="spellEnd"/>
-    </w:p>
-    <w:p>
-      <w:pPr>
-        <w:pStyle w:val="aa"/>
-      </w:pPr>
-      <w:r>
-        <w:t xml:space="preserve">                </w:t>
-      </w:r>
-      <w:proofErr w:type="spellStart"/>
-      <w:r>
-        <w:t>elif</w:t>
-      </w:r>
-      <w:proofErr w:type="spellEnd"/>
-      <w:r>
-        <w:t xml:space="preserve"> </w:t>
-      </w:r>
-      <w:proofErr w:type="spellStart"/>
-      <w:r>
-        <w:t>isinstance</w:t>
-      </w:r>
-      <w:proofErr w:type="spellEnd"/>
-      <w:r>
-        <w:t>(</w:t>
-      </w:r>
-      <w:proofErr w:type="spellStart"/>
-      <w:r>
-        <w:t>hint</w:t>
-      </w:r>
-      <w:proofErr w:type="spellEnd"/>
-      <w:r>
-        <w:t xml:space="preserve">, </w:t>
-      </w:r>
-      <w:proofErr w:type="spellStart"/>
-      <w:r>
-        <w:t>ListboxHint</w:t>
-      </w:r>
-      <w:proofErr w:type="spellEnd"/>
-      <w:r>
-        <w:t>):</w:t>
-      </w:r>
-    </w:p>
-    <w:p>
-      <w:pPr>
-        <w:pStyle w:val="aa"/>
-      </w:pPr>
-      <w:r>
-        <w:t xml:space="preserve">                    </w:t>
-      </w:r>
-      <w:proofErr w:type="spellStart"/>
-      <w:r>
         <w:t>listbox_hint</w:t>
       </w:r>
       <w:proofErr w:type="spellEnd"/>
       <w:r>
-        <w:t xml:space="preserve"> = </w:t>
-      </w:r>
-      <w:proofErr w:type="spellStart"/>
-      <w:r>
-        <w:t>hint</w:t>
-      </w:r>
-      <w:proofErr w:type="spellEnd"/>
+        <w:t xml:space="preserve"> = hint</w:t>
+      </w:r>
     </w:p>
     <w:p>
       <w:pPr>
@@ -9887,15 +9877,79 @@
       </w:r>
       <w:proofErr w:type="spellEnd"/>
       <w:r>
+        <w:t>, width=10)</w:t>
+      </w:r>
+    </w:p>
+    <w:p>
+      <w:pPr>
+        <w:pStyle w:val="aa"/>
+      </w:pPr>
+      <w:r>
+        <w:t xml:space="preserve">                        </w:t>
+      </w:r>
+      <w:proofErr w:type="spellStart"/>
+      <w:r>
+        <w:t>spin.bind</w:t>
+      </w:r>
+      <w:proofErr w:type="spellEnd"/>
+      <w:r>
+        <w:t>("&lt;</w:t>
+      </w:r>
+      <w:proofErr w:type="spellStart"/>
+      <w:r>
+        <w:t>FocusOut</w:t>
+      </w:r>
+      <w:proofErr w:type="spellEnd"/>
+      <w:r>
+        <w:t xml:space="preserve">&gt;", </w:t>
+      </w:r>
+      <w:proofErr w:type="spellStart"/>
+      <w:r>
+        <w:t>validate_range</w:t>
+      </w:r>
+      <w:proofErr w:type="spellEnd"/>
+      <w:r>
+        <w:t>)</w:t>
+      </w:r>
+    </w:p>
+    <w:p>
+      <w:pPr>
+        <w:pStyle w:val="aa"/>
+      </w:pPr>
+      <w:r>
+        <w:t xml:space="preserve">                        </w:t>
+      </w:r>
+      <w:proofErr w:type="spellStart"/>
+      <w:r>
+        <w:t>spin.pack</w:t>
+      </w:r>
+      <w:proofErr w:type="spellEnd"/>
+      <w:r>
+        <w:t>(</w:t>
+      </w:r>
+      <w:proofErr w:type="spellStart"/>
+      <w:r>
+        <w:t>side</w:t>
+      </w:r>
+      <w:proofErr w:type="spellEnd"/>
+      <w:r>
+        <w:t>=</w:t>
+      </w:r>
+      <w:proofErr w:type="spellStart"/>
+      <w:r>
+        <w:t>tk.LEFT</w:t>
+      </w:r>
+      <w:proofErr w:type="spellEnd"/>
+      <w:r>
         <w:t xml:space="preserve">, </w:t>
       </w:r>
       <w:proofErr w:type="spellStart"/>
       <w:r>
-        <w:t>width</w:t>
-      </w:r>
-      <w:proofErr w:type="spellEnd"/>
-      <w:r>
-        <w:t>=10)</w:t>
+        <w:t>padx</w:t>
+      </w:r>
+      <w:proofErr w:type="spellEnd"/>
+      <w:r>
+        <w:t>=5)</w:t>
       </w:r>
     </w:p>
     <w:p>
@@ -9907,27 +9961,75 @@
       </w:r>
       <w:proofErr w:type="spellStart"/>
       <w:r>
-        <w:t>spin.bind</w:t>
-      </w:r>
-      <w:proofErr w:type="spellEnd"/>
-      <w:r>
-        <w:t>("&lt;</w:t>
-      </w:r>
-      <w:proofErr w:type="spellStart"/>
-      <w:r>
-        <w:t>FocusOut</w:t>
-      </w:r>
-      <w:proofErr w:type="spellEnd"/>
-      <w:r>
-        <w:t xml:space="preserve">&gt;", </w:t>
-      </w:r>
-      <w:proofErr w:type="spellStart"/>
-      <w:r>
-        <w:t>validate_range</w:t>
-      </w:r>
-      <w:proofErr w:type="spellEnd"/>
-      <w:r>
-        <w:t>)</w:t>
+        <w:t>val_var.set</w:t>
+      </w:r>
+      <w:proofErr w:type="spellEnd"/>
+      <w:r>
+        <w:t>(</w:t>
+      </w:r>
+      <w:proofErr w:type="spellStart"/>
+      <w:r>
+        <w:t>str</w:t>
+      </w:r>
+      <w:proofErr w:type="spellEnd"/>
+      <w:r>
+        <w:t>(</w:t>
+      </w:r>
+      <w:proofErr w:type="spellStart"/>
+      <w:r>
+        <w:t>range_hint.min_value</w:t>
+      </w:r>
+      <w:proofErr w:type="spellEnd"/>
+      <w:r>
+        <w:t>))</w:t>
+      </w:r>
+    </w:p>
+    <w:p>
+      <w:pPr>
+        <w:pStyle w:val="aa"/>
+      </w:pPr>
+      <w:r>
+        <w:t xml:space="preserve">                    </w:t>
+      </w:r>
+      <w:proofErr w:type="spellStart"/>
+      <w:r>
+        <w:t>elif</w:t>
+      </w:r>
+      <w:proofErr w:type="spellEnd"/>
+      <w:r>
+        <w:t xml:space="preserve"> </w:t>
+      </w:r>
+      <w:proofErr w:type="spellStart"/>
+      <w:r>
+        <w:t>range_hint.max_value</w:t>
+      </w:r>
+      <w:proofErr w:type="spellEnd"/>
+      <w:r>
+        <w:t xml:space="preserve"> </w:t>
+      </w:r>
+      <w:proofErr w:type="spellStart"/>
+      <w:r>
+        <w:t>is</w:t>
+      </w:r>
+      <w:proofErr w:type="spellEnd"/>
+      <w:r>
+        <w:t xml:space="preserve"> </w:t>
+      </w:r>
+      <w:proofErr w:type="spellStart"/>
+      <w:r>
+        <w:t>not</w:t>
+      </w:r>
+      <w:proofErr w:type="spellEnd"/>
+      <w:r>
+        <w:t xml:space="preserve"> </w:t>
+      </w:r>
+      <w:proofErr w:type="spellStart"/>
+      <w:r>
+        <w:t>None</w:t>
+      </w:r>
+      <w:proofErr w:type="spellEnd"/>
+      <w:r>
+        <w:t>:</w:t>
       </w:r>
     </w:p>
     <w:p>
@@ -9939,7 +10041,15 @@
       </w:r>
       <w:proofErr w:type="spellStart"/>
       <w:r>
-        <w:t>spin.pack</w:t>
+        <w:t>spin</w:t>
+      </w:r>
+      <w:proofErr w:type="spellEnd"/>
+      <w:r>
+        <w:t xml:space="preserve"> = </w:t>
+      </w:r>
+      <w:proofErr w:type="spellStart"/>
+      <w:r>
+        <w:t>tk.Spinbox</w:t>
       </w:r>
       <w:proofErr w:type="spellEnd"/>
       <w:r>
@@ -9947,7 +10057,23 @@
       </w:r>
       <w:proofErr w:type="spellStart"/>
       <w:r>
-        <w:t>side</w:t>
+        <w:t>widget_container</w:t>
+      </w:r>
+      <w:proofErr w:type="spellEnd"/>
+      <w:r>
+        <w:t xml:space="preserve">, </w:t>
+      </w:r>
+      <w:proofErr w:type="spellStart"/>
+      <w:r>
+        <w:t>from</w:t>
+      </w:r>
+      <w:proofErr w:type="spellEnd"/>
+      <w:r>
+        <w:t xml:space="preserve">_=-999999, </w:t>
+      </w:r>
+      <w:proofErr w:type="spellStart"/>
+      <w:r>
+        <w:t>to</w:t>
       </w:r>
       <w:proofErr w:type="spellEnd"/>
       <w:r>
@@ -9955,63 +10081,31 @@
       </w:r>
       <w:proofErr w:type="spellStart"/>
       <w:r>
-        <w:t>tk.LEFT</w:t>
-      </w:r>
-      <w:proofErr w:type="spellEnd"/>
-      <w:r>
-        <w:t xml:space="preserve">, </w:t>
-      </w:r>
-      <w:proofErr w:type="spellStart"/>
-      <w:r>
-        <w:t>padx</w:t>
-      </w:r>
-      <w:proofErr w:type="spellEnd"/>
-      <w:r>
-        <w:t>=5)</w:t>
-      </w:r>
-    </w:p>
-    <w:p>
-      <w:pPr>
-        <w:pStyle w:val="aa"/>
-      </w:pPr>
-      <w:r>
-        <w:t xml:space="preserve">                        </w:t>
-      </w:r>
-      <w:proofErr w:type="spellStart"/>
-      <w:r>
-        <w:t>val_var.set</w:t>
-      </w:r>
-      <w:proofErr w:type="spellEnd"/>
-      <w:r>
-        <w:t>(</w:t>
-      </w:r>
-      <w:proofErr w:type="spellStart"/>
-      <w:r>
-        <w:t>str</w:t>
-      </w:r>
-      <w:proofErr w:type="spellEnd"/>
-      <w:r>
-        <w:t>(</w:t>
-      </w:r>
-      <w:proofErr w:type="spellStart"/>
-      <w:r>
-        <w:t>range_hint.min_value</w:t>
-      </w:r>
-      <w:proofErr w:type="spellEnd"/>
-      <w:r>
-        <w:t>))</w:t>
-      </w:r>
-    </w:p>
-    <w:p>
-      <w:pPr>
-        <w:pStyle w:val="aa"/>
-      </w:pPr>
-      <w:r>
-        <w:t xml:space="preserve">                    </w:t>
-      </w:r>
-      <w:proofErr w:type="spellStart"/>
-      <w:r>
-        <w:t>elif</w:t>
+        <w:t>range_hint.max_value</w:t>
+      </w:r>
+      <w:proofErr w:type="spellEnd"/>
+      <w:r>
+        <w:t>,</w:t>
+      </w:r>
+    </w:p>
+    <w:p>
+      <w:pPr>
+        <w:pStyle w:val="aa"/>
+      </w:pPr>
+      <w:r>
+        <w:t xml:space="preserve">                                        </w:t>
+      </w:r>
+      <w:proofErr w:type="spellStart"/>
+      <w:r>
+        <w:t>increment</w:t>
+      </w:r>
+      <w:proofErr w:type="spellEnd"/>
+      <w:r>
+        <w:t xml:space="preserve">=1 </w:t>
+      </w:r>
+      <w:proofErr w:type="spellStart"/>
+      <w:r>
+        <w:t>if</w:t>
       </w:r>
       <w:proofErr w:type="spellEnd"/>
       <w:r>
@@ -10019,7 +10113,15 @@
       </w:r>
       <w:proofErr w:type="spellStart"/>
       <w:r>
-        <w:t>range_hint.max_value</w:t>
+        <w:t>parse_type</w:t>
+      </w:r>
+      <w:proofErr w:type="spellEnd"/>
+      <w:r>
+        <w:t xml:space="preserve"> == </w:t>
+      </w:r>
+      <w:proofErr w:type="spellStart"/>
+      <w:r>
+        <w:t>int</w:t>
       </w:r>
       <w:proofErr w:type="spellEnd"/>
       <w:r>
@@ -10027,71 +10129,23 @@
       </w:r>
       <w:proofErr w:type="spellStart"/>
       <w:r>
-        <w:t>is</w:t>
-      </w:r>
-      <w:proofErr w:type="spellEnd"/>
-      <w:r>
-        <w:t xml:space="preserve"> </w:t>
-      </w:r>
-      <w:proofErr w:type="spellStart"/>
-      <w:r>
-        <w:t>not</w:t>
-      </w:r>
-      <w:proofErr w:type="spellEnd"/>
-      <w:r>
-        <w:t xml:space="preserve"> </w:t>
-      </w:r>
-      <w:proofErr w:type="spellStart"/>
-      <w:r>
-        <w:t>None</w:t>
-      </w:r>
-      <w:proofErr w:type="spellEnd"/>
-      <w:r>
-        <w:t>:</w:t>
-      </w:r>
-    </w:p>
-    <w:p>
-      <w:pPr>
-        <w:pStyle w:val="aa"/>
-      </w:pPr>
-      <w:r>
-        <w:t xml:space="preserve">                        </w:t>
-      </w:r>
-      <w:proofErr w:type="spellStart"/>
-      <w:r>
-        <w:t>spin</w:t>
-      </w:r>
-      <w:proofErr w:type="spellEnd"/>
-      <w:r>
-        <w:t xml:space="preserve"> = </w:t>
-      </w:r>
-      <w:proofErr w:type="spellStart"/>
-      <w:r>
-        <w:t>tk.Spinbox</w:t>
-      </w:r>
-      <w:proofErr w:type="spellEnd"/>
-      <w:r>
-        <w:t>(</w:t>
-      </w:r>
-      <w:proofErr w:type="spellStart"/>
-      <w:r>
-        <w:t>widget_container</w:t>
-      </w:r>
-      <w:proofErr w:type="spellEnd"/>
-      <w:r>
-        <w:t xml:space="preserve">, </w:t>
-      </w:r>
-      <w:proofErr w:type="spellStart"/>
-      <w:r>
-        <w:t>from</w:t>
-      </w:r>
-      <w:proofErr w:type="spellEnd"/>
-      <w:r>
-        <w:t xml:space="preserve">_=-999999, </w:t>
-      </w:r>
-      <w:proofErr w:type="spellStart"/>
-      <w:r>
-        <w:t>to</w:t>
+        <w:t>else</w:t>
+      </w:r>
+      <w:proofErr w:type="spellEnd"/>
+      <w:r>
+        <w:t xml:space="preserve"> 0.1,</w:t>
+      </w:r>
+    </w:p>
+    <w:p>
+      <w:pPr>
+        <w:pStyle w:val="aa"/>
+      </w:pPr>
+      <w:r>
+        <w:t xml:space="preserve">                                        </w:t>
+      </w:r>
+      <w:proofErr w:type="spellStart"/>
+      <w:r>
+        <w:t>textvariable</w:t>
       </w:r>
       <w:proofErr w:type="spellEnd"/>
       <w:r>
@@ -10099,91 +10153,11 @@
       </w:r>
       <w:proofErr w:type="spellStart"/>
       <w:r>
-        <w:t>range_hint.max_value</w:t>
-      </w:r>
-      <w:proofErr w:type="spellEnd"/>
-      <w:r>
-        <w:t>,</w:t>
-      </w:r>
-    </w:p>
-    <w:p>
-      <w:pPr>
-        <w:pStyle w:val="aa"/>
-      </w:pPr>
-      <w:r>
-        <w:t xml:space="preserve">                                        </w:t>
-      </w:r>
-      <w:proofErr w:type="spellStart"/>
-      <w:r>
-        <w:t>increment</w:t>
-      </w:r>
-      <w:proofErr w:type="spellEnd"/>
-      <w:r>
-        <w:t xml:space="preserve">=1 </w:t>
-      </w:r>
-      <w:proofErr w:type="spellStart"/>
-      <w:r>
-        <w:t>if</w:t>
-      </w:r>
-      <w:proofErr w:type="spellEnd"/>
-      <w:r>
-        <w:t xml:space="preserve"> </w:t>
-      </w:r>
-      <w:proofErr w:type="spellStart"/>
-      <w:r>
-        <w:t>parse_type</w:t>
-      </w:r>
-      <w:proofErr w:type="spellEnd"/>
-      <w:r>
-        <w:t xml:space="preserve"> == </w:t>
-      </w:r>
-      <w:proofErr w:type="spellStart"/>
-      <w:r>
-        <w:t>int</w:t>
-      </w:r>
-      <w:proofErr w:type="spellEnd"/>
-      <w:r>
-        <w:t xml:space="preserve"> </w:t>
-      </w:r>
-      <w:proofErr w:type="spellStart"/>
-      <w:r>
-        <w:t>else</w:t>
-      </w:r>
-      <w:proofErr w:type="spellEnd"/>
-      <w:r>
-        <w:t xml:space="preserve"> 0.1,</w:t>
-      </w:r>
-    </w:p>
-    <w:p>
-      <w:pPr>
-        <w:pStyle w:val="aa"/>
-      </w:pPr>
-      <w:r>
-        <w:t xml:space="preserve">                                        </w:t>
-      </w:r>
-      <w:proofErr w:type="spellStart"/>
-      <w:r>
-        <w:t>textvariable</w:t>
-      </w:r>
-      <w:proofErr w:type="spellEnd"/>
-      <w:r>
-        <w:t>=</w:t>
-      </w:r>
-      <w:proofErr w:type="spellStart"/>
-      <w:r>
         <w:t>val_var</w:t>
       </w:r>
       <w:proofErr w:type="spellEnd"/>
       <w:r>
-        <w:t xml:space="preserve">, </w:t>
-      </w:r>
-      <w:proofErr w:type="spellStart"/>
-      <w:r>
-        <w:t>width</w:t>
-      </w:r>
-      <w:proofErr w:type="spellEnd"/>
-      <w:r>
-        <w:t>=10)</w:t>
+        <w:t>, width=10)</w:t>
       </w:r>
     </w:p>
     <w:p>
@@ -11733,13 +11707,8 @@
       </w:r>
       <w:proofErr w:type="spellEnd"/>
       <w:r>
-        <w:t xml:space="preserve"> = </w:t>
-      </w:r>
-      <w:proofErr w:type="spellStart"/>
-      <w:r>
-        <w:t>False</w:t>
-      </w:r>
-      <w:proofErr w:type="spellEnd"/>
+        <w:t xml:space="preserve"> = False</w:t>
+      </w:r>
     </w:p>
     <w:p>
       <w:pPr>
@@ -12534,10 +12503,7 @@
         <w:fldChar w:fldCharType="end"/>
       </w:r>
       <w:r>
-        <w:t xml:space="preserve"> - приклад </w:t>
-      </w:r>
-      <w:r>
-        <w:t>помилки</w:t>
+        <w:t xml:space="preserve"> - приклад помилки</w:t>
       </w:r>
     </w:p>
     <w:p/>
@@ -12583,7 +12549,7 @@
           <w:rPr>
             <w:rStyle w:val="ae"/>
           </w:rPr>
-          <w:t>https://github.com/Figeiron/IndividualCreativeAssignment/releases/tag/LabWork_13-v0.0.2</w:t>
+          <w:t>https://github.com/Figeiron/IndividualCreativeAssignment/releases/tag/LabWork_14-v0.0.2</w:t>
         </w:r>
       </w:hyperlink>
     </w:p>

</xml_diff>